<commit_message>
Insert Metrocity College Database Project
</commit_message>
<xml_diff>
--- a/A05_MetroCity_Updated_Template.docx
+++ b/A05_MetroCity_Updated_Template.docx
@@ -335,23 +335,13 @@
             <w:pPr>
               <w:pStyle w:val="LithanTableContentNormal"/>
             </w:pPr>
-            <w:proofErr w:type="spellStart"/>
             <w:r>
               <w:rPr>
                 <w:rFonts w:ascii="Montserrat" w:hAnsi="Montserrat"/>
                 <w:sz w:val="24"/>
                 <w:szCs w:val="24"/>
               </w:rPr>
-              <w:t>MetroCity</w:t>
-            </w:r>
-            <w:proofErr w:type="spellEnd"/>
-            <w:r>
-              <w:rPr>
-                <w:rFonts w:ascii="Montserrat" w:hAnsi="Montserrat"/>
-                <w:sz w:val="24"/>
-                <w:szCs w:val="24"/>
-              </w:rPr>
-              <w:t xml:space="preserve"> College Record Management Review</w:t>
+              <w:t>MetroCity College Record Management Review</w:t>
             </w:r>
           </w:p>
         </w:tc>
@@ -2076,37 +2066,12 @@
           <w:szCs w:val="24"/>
         </w:rPr>
       </w:pPr>
-      <w:proofErr w:type="spellStart"/>
       <w:r>
         <w:rPr>
           <w:sz w:val="24"/>
           <w:szCs w:val="24"/>
         </w:rPr>
-        <w:t>MetroCity</w:t>
-      </w:r>
-      <w:proofErr w:type="spellEnd"/>
-      <w:r>
-        <w:rPr>
-          <w:sz w:val="24"/>
-          <w:szCs w:val="24"/>
-        </w:rPr>
-        <w:t xml:space="preserve"> College manages student information across multiple departments, including student profiles, courses, </w:t>
-      </w:r>
-      <w:proofErr w:type="spellStart"/>
-      <w:r>
-        <w:rPr>
-          <w:sz w:val="24"/>
-          <w:szCs w:val="24"/>
-        </w:rPr>
-        <w:t>enrollments</w:t>
-      </w:r>
-      <w:proofErr w:type="spellEnd"/>
-      <w:r>
-        <w:rPr>
-          <w:sz w:val="24"/>
-          <w:szCs w:val="24"/>
-        </w:rPr>
-        <w:t>, and examination results. The database system has already been designed, implemented, and tested in previous coursework. This project focuses on the final stage of the database lifecycle by documenting the completed database, organizing project files, and preparing the system for collaboration and future maintenance using professional database documentation and version control tools.</w:t>
+        <w:t>MetroCity College manages student information across multiple departments, including student profiles, courses, enrollments, and examination results. The database system has already been designed, implemented, and tested in previous coursework. This project focuses on the final stage of the database lifecycle by documenting the completed database, organizing project files, and preparing the system for collaboration and future maintenance using professional database documentation and version control tools.</w:t>
       </w:r>
     </w:p>
     <w:p>
@@ -2164,21 +2129,7 @@
         <w:rPr>
           <w:rFonts w:asciiTheme="minorHAnsi" w:hAnsiTheme="minorHAnsi" w:cstheme="minorHAnsi"/>
         </w:rPr>
-        <w:t xml:space="preserve">The objective of this project is to professionally document and manage the completed </w:t>
-      </w:r>
-      <w:proofErr w:type="spellStart"/>
-      <w:r>
-        <w:rPr>
-          <w:rFonts w:asciiTheme="minorHAnsi" w:hAnsiTheme="minorHAnsi" w:cstheme="minorHAnsi"/>
-        </w:rPr>
-        <w:t>MetroCity</w:t>
-      </w:r>
-      <w:proofErr w:type="spellEnd"/>
-      <w:r>
-        <w:rPr>
-          <w:rFonts w:asciiTheme="minorHAnsi" w:hAnsiTheme="minorHAnsi" w:cstheme="minorHAnsi"/>
-        </w:rPr>
-        <w:t xml:space="preserve"> College Student Management Database. Learners will generate database documentation, create a data dictionary, use Git and GitHub for version control, prepare a professional README.md file, upload all project files to a GitHub repository, and produce a report demonstrating the complete documentation and collaboration process.</w:t>
+        <w:t>The objective of this project is to professionally document and manage the completed MetroCity College Student Management Database. Learners will generate database documentation, create a data dictionary, use Git and GitHub for version control, prepare a professional README.md file, upload all project files to a GitHub repository, and produce a report demonstrating the complete documentation and collaboration process.</w:t>
       </w:r>
     </w:p>
     <w:p>
@@ -2982,15 +2933,7 @@
         </w:drawing>
       </w:r>
       <w:r>
-        <w:t xml:space="preserve">This table stores the academic departments available at </w:t>
-      </w:r>
-      <w:proofErr w:type="spellStart"/>
-      <w:r>
-        <w:t>MetroCity</w:t>
-      </w:r>
-      <w:proofErr w:type="spellEnd"/>
-      <w:r>
-        <w:t xml:space="preserve"> College and is used to organize students and courses.</w:t>
+        <w:t>This table stores the academic departments available at MetroCity College and is used to organize students and courses.</w:t>
       </w:r>
     </w:p>
     <w:p>
@@ -3269,7 +3212,6 @@
         </w:rPr>
         <w:t xml:space="preserve">Table: </w:t>
       </w:r>
-      <w:proofErr w:type="spellStart"/>
       <w:r>
         <w:rPr>
           <w:rFonts w:cstheme="minorHAnsi"/>
@@ -3280,7 +3222,6 @@
         </w:rPr>
         <w:t>enrollments</w:t>
       </w:r>
-      <w:proofErr w:type="spellEnd"/>
     </w:p>
     <w:p>
       <w:pPr>
@@ -3401,7 +3342,6 @@
         </w:rPr>
         <w:t xml:space="preserve">Table: </w:t>
       </w:r>
-      <w:proofErr w:type="spellStart"/>
       <w:r>
         <w:rPr>
           <w:rFonts w:cstheme="minorHAnsi"/>
@@ -3412,7 +3352,6 @@
         </w:rPr>
         <w:t>exam_resulta</w:t>
       </w:r>
-      <w:proofErr w:type="spellEnd"/>
     </w:p>
     <w:p>
       <w:pPr>
@@ -3495,15 +3434,7 @@
         </w:drawing>
       </w:r>
       <w:r>
-        <w:t xml:space="preserve">This table stores students' exam performance, including the exam date, score, and final grade for each </w:t>
-      </w:r>
-      <w:proofErr w:type="spellStart"/>
-      <w:r>
-        <w:t>enrollment</w:t>
-      </w:r>
-      <w:proofErr w:type="spellEnd"/>
-      <w:r>
-        <w:t>.</w:t>
+        <w:t>This table stores students' exam performance, including the exam date, score, and final grade for each enrollment.</w:t>
       </w:r>
     </w:p>
     <w:p>
@@ -3768,7 +3699,7 @@
           </mc:Choice>
           <mc:Fallback>
             <w:pict>
-              <v:shape w14:anchorId="6C370265" id="Frame 46" o:spid="_x0000_s1026" style="position:absolute;margin-left:0;margin-top:78.6pt;width:438.75pt;height:17.3pt;z-index:251720704;visibility:visible;mso-wrap-style:square;mso-width-percent:0;mso-height-percent:0;mso-wrap-distance-left:9pt;mso-wrap-distance-top:0;mso-wrap-distance-right:9pt;mso-wrap-distance-bottom:0;mso-position-horizontal:left;mso-position-horizontal-relative:margin;mso-position-vertical:absolute;mso-position-vertical-relative:text;mso-width-percent:0;mso-height-percent:0;mso-width-relative:margin;mso-height-relative:margin;v-text-anchor:middle" coordsize="5572125,219710" o:gfxdata="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" path="m,l5572125,r,219710l,219710,,xm27464,27464r,164782l5544661,192246r,-164782l27464,27464xe" fillcolor="red" strokecolor="red" strokeweight="1pt">
+              <v:shape w14:anchorId="2E2C79FD" id="Frame 46" o:spid="_x0000_s1026" style="position:absolute;margin-left:0;margin-top:78.6pt;width:438.75pt;height:17.3pt;z-index:251720704;visibility:visible;mso-wrap-style:square;mso-width-percent:0;mso-height-percent:0;mso-wrap-distance-left:9pt;mso-wrap-distance-top:0;mso-wrap-distance-right:9pt;mso-wrap-distance-bottom:0;mso-position-horizontal:left;mso-position-horizontal-relative:margin;mso-position-vertical:absolute;mso-position-vertical-relative:text;mso-width-percent:0;mso-height-percent:0;mso-width-relative:margin;mso-height-relative:margin;v-text-anchor:middle" coordsize="5572125,219710" o:gfxdata="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" path="m,l5572125,r,219710l,219710,,xm27464,27464r,164782l5544661,192246r,-164782l27464,27464xe" fillcolor="red" strokecolor="red" strokeweight="1pt">
                 <v:stroke joinstyle="miter"/>
                 <v:path arrowok="t" o:connecttype="custom" o:connectlocs="0,0;5572125,0;5572125,219710;0,219710;0,0;27464,27464;27464,192246;5544661,192246;5544661,27464;27464,27464" o:connectangles="0,0,0,0,0,0,0,0,0,0"/>
                 <w10:wrap anchorx="margin"/>
@@ -3906,22 +3837,9 @@
           <w:sz w:val="28"/>
           <w:szCs w:val="28"/>
         </w:rPr>
-        <w:t xml:space="preserve">Generate Database Documentation Using </w:t>
-      </w:r>
-      <w:proofErr w:type="spellStart"/>
-      <w:r>
-        <w:rPr>
-          <w:rFonts w:ascii="Montserrat" w:hAnsi="Montserrat"/>
-          <w:b/>
-          <w:bCs/>
-          <w:color w:val="1A3E6B"/>
-          <w:sz w:val="28"/>
-          <w:szCs w:val="28"/>
-        </w:rPr>
-        <w:t>dbForge</w:t>
+        <w:t>Generate Database Documentation Using dbForge</w:t>
       </w:r>
       <w:bookmarkEnd w:id="4"/>
-      <w:proofErr w:type="spellEnd"/>
     </w:p>
     <w:p>
       <w:pPr>
@@ -4020,31 +3938,7 @@
           <w:szCs w:val="28"/>
           <w:u w:val="single"/>
         </w:rPr>
-        <w:t xml:space="preserve">Step 1: Launch and Open </w:t>
-      </w:r>
-      <w:proofErr w:type="spellStart"/>
-      <w:r>
-        <w:rPr>
-          <w:b/>
-          <w:bCs/>
-          <w:color w:val="000000"/>
-          <w:sz w:val="28"/>
-          <w:szCs w:val="28"/>
-          <w:u w:val="single"/>
-        </w:rPr>
-        <w:t>dbForge</w:t>
-      </w:r>
-      <w:proofErr w:type="spellEnd"/>
-      <w:r>
-        <w:rPr>
-          <w:b/>
-          <w:bCs/>
-          <w:color w:val="000000"/>
-          <w:sz w:val="28"/>
-          <w:szCs w:val="28"/>
-          <w:u w:val="single"/>
-        </w:rPr>
-        <w:t xml:space="preserve"> Studio</w:t>
+        <w:t>Step 1: Launch and Open dbForge Studio</w:t>
       </w:r>
     </w:p>
     <w:p>
@@ -4356,7 +4250,7 @@
           </mc:Choice>
           <mc:Fallback>
             <w:pict>
-              <v:shape w14:anchorId="209E77FC" id="Frame 12" o:spid="_x0000_s1026" style="position:absolute;margin-left:56.25pt;margin-top:15.75pt;width:44.25pt;height:18pt;z-index:251670528;visibility:visible;mso-wrap-style:square;mso-width-percent:0;mso-height-percent:0;mso-wrap-distance-left:9pt;mso-wrap-distance-top:0;mso-wrap-distance-right:9pt;mso-wrap-distance-bottom:0;mso-position-horizontal:absolute;mso-position-horizontal-relative:text;mso-position-vertical:absolute;mso-position-vertical-relative:text;mso-width-percent:0;mso-height-percent:0;mso-width-relative:margin;mso-height-relative:margin;v-text-anchor:middle" coordsize="561975,228600" o:gfxdata="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" path="m,l561975,r,228600l,228600,,xm28575,28575r,171450l533400,200025r,-171450l28575,28575xe" fillcolor="red" strokecolor="red" strokeweight="1pt">
+              <v:shape w14:anchorId="7256DDF0" id="Frame 12" o:spid="_x0000_s1026" style="position:absolute;margin-left:56.25pt;margin-top:15.75pt;width:44.25pt;height:18pt;z-index:251670528;visibility:visible;mso-wrap-style:square;mso-width-percent:0;mso-height-percent:0;mso-wrap-distance-left:9pt;mso-wrap-distance-top:0;mso-wrap-distance-right:9pt;mso-wrap-distance-bottom:0;mso-position-horizontal:absolute;mso-position-horizontal-relative:text;mso-position-vertical:absolute;mso-position-vertical-relative:text;mso-width-percent:0;mso-height-percent:0;mso-width-relative:margin;mso-height-relative:margin;v-text-anchor:middle" coordsize="561975,228600" o:gfxdata="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" path="m,l561975,r,228600l,228600,,xm28575,28575r,171450l533400,200025r,-171450l28575,28575xe" fillcolor="red" strokecolor="red" strokeweight="1pt">
                 <v:stroke joinstyle="miter"/>
                 <v:path arrowok="t" o:connecttype="custom" o:connectlocs="0,0;561975,0;561975,228600;0,228600;0,0;28575,28575;28575,200025;533400,200025;533400,28575;28575,28575" o:connectangles="0,0,0,0,0,0,0,0,0,0"/>
               </v:shape>
@@ -4662,7 +4556,7 @@
           </mc:Choice>
           <mc:Fallback>
             <w:pict>
-              <v:shapetype w14:anchorId="6DDC782C" id="_x0000_t32" coordsize="21600,21600" o:spt="32" o:oned="t" path="m,l21600,21600e" filled="f">
+              <v:shapetype w14:anchorId="1ED025D7" id="_x0000_t32" coordsize="21600,21600" o:spt="32" o:oned="t" path="m,l21600,21600e" filled="f">
                 <v:path arrowok="t" fillok="f" o:connecttype="none"/>
                 <o:lock v:ext="edit" shapetype="t"/>
               </v:shapetype>
@@ -4905,7 +4799,7 @@
           </mc:Choice>
           <mc:Fallback>
             <w:pict>
-              <v:shape w14:anchorId="173BD551" id="Straight Arrow Connector 14" o:spid="_x0000_s1026" type="#_x0000_t32" style="position:absolute;margin-left:349.5pt;margin-top:.8pt;width:53.25pt;height:36pt;flip:x;z-index:251673600;visibility:visible;mso-wrap-style:square;mso-width-percent:0;mso-height-percent:0;mso-wrap-distance-left:9pt;mso-wrap-distance-top:0;mso-wrap-distance-right:9pt;mso-wrap-distance-bottom:0;mso-position-horizontal:absolute;mso-position-horizontal-relative:margin;mso-position-vertical:absolute;mso-position-vertical-relative:text;mso-width-percent:0;mso-height-percent:0;mso-width-relative:margin;mso-height-relative:margin" o:gfxdata="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" strokecolor="red" strokeweight=".5pt">
+              <v:shape w14:anchorId="6AEB75CB" id="Straight Arrow Connector 14" o:spid="_x0000_s1026" type="#_x0000_t32" style="position:absolute;margin-left:349.5pt;margin-top:.8pt;width:53.25pt;height:36pt;flip:x;z-index:251673600;visibility:visible;mso-wrap-style:square;mso-width-percent:0;mso-height-percent:0;mso-wrap-distance-left:9pt;mso-wrap-distance-top:0;mso-wrap-distance-right:9pt;mso-wrap-distance-bottom:0;mso-position-horizontal:absolute;mso-position-horizontal-relative:margin;mso-position-vertical:absolute;mso-position-vertical-relative:text;mso-width-percent:0;mso-height-percent:0;mso-width-relative:margin;mso-height-relative:margin" o:gfxdata="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" strokecolor="red" strokeweight=".5pt">
                 <v:stroke endarrow="block" joinstyle="miter"/>
                 <w10:wrap anchorx="margin"/>
               </v:shape>
@@ -5152,7 +5046,7 @@
           </mc:Choice>
           <mc:Fallback>
             <w:pict>
-              <v:shape w14:anchorId="45FD1048" id="Straight Arrow Connector 15" o:spid="_x0000_s1026" type="#_x0000_t32" style="position:absolute;margin-left:326.95pt;margin-top:3.05pt;width:30.75pt;height:15pt;flip:x y;z-index:251675648;visibility:visible;mso-wrap-style:square;mso-width-percent:0;mso-height-percent:0;mso-wrap-distance-left:9pt;mso-wrap-distance-top:0;mso-wrap-distance-right:9pt;mso-wrap-distance-bottom:0;mso-position-horizontal:absolute;mso-position-horizontal-relative:text;mso-position-vertical:absolute;mso-position-vertical-relative:text;mso-width-percent:0;mso-height-percent:0;mso-width-relative:margin;mso-height-relative:margin" o:gfxdata="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" strokecolor="red" strokeweight=".5pt">
+              <v:shape w14:anchorId="284FCBFB" id="Straight Arrow Connector 15" o:spid="_x0000_s1026" type="#_x0000_t32" style="position:absolute;margin-left:326.95pt;margin-top:3.05pt;width:30.75pt;height:15pt;flip:x y;z-index:251675648;visibility:visible;mso-wrap-style:square;mso-width-percent:0;mso-height-percent:0;mso-wrap-distance-left:9pt;mso-wrap-distance-top:0;mso-wrap-distance-right:9pt;mso-wrap-distance-bottom:0;mso-position-horizontal:absolute;mso-position-horizontal-relative:text;mso-position-vertical:absolute;mso-position-vertical-relative:text;mso-width-percent:0;mso-height-percent:0;mso-width-relative:margin;mso-height-relative:margin" o:gfxdata="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" strokecolor="red" strokeweight=".5pt">
                 <v:stroke endarrow="block" joinstyle="miter"/>
               </v:shape>
             </w:pict>
@@ -5477,7 +5371,7 @@
           </mc:Choice>
           <mc:Fallback>
             <w:pict>
-              <v:shape w14:anchorId="1604EF74" id="Frame 31" o:spid="_x0000_s1026" style="position:absolute;margin-left:311.25pt;margin-top:13.4pt;width:63.75pt;height:24pt;z-index:251698176;visibility:visible;mso-wrap-style:square;mso-width-percent:0;mso-height-percent:0;mso-wrap-distance-left:9pt;mso-wrap-distance-top:0;mso-wrap-distance-right:9pt;mso-wrap-distance-bottom:0;mso-position-horizontal:absolute;mso-position-horizontal-relative:margin;mso-position-vertical:absolute;mso-position-vertical-relative:text;mso-width-percent:0;mso-height-percent:0;mso-width-relative:margin;mso-height-relative:margin;v-text-anchor:middle" coordsize="809625,304800" o:gfxdata="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" path="m,l809625,r,304800l,304800,,xm38100,38100r,228600l771525,266700r,-228600l38100,38100xe" fillcolor="red" strokecolor="red" strokeweight="1pt">
+              <v:shape w14:anchorId="7FE9D602" id="Frame 31" o:spid="_x0000_s1026" style="position:absolute;margin-left:311.25pt;margin-top:13.4pt;width:63.75pt;height:24pt;z-index:251698176;visibility:visible;mso-wrap-style:square;mso-width-percent:0;mso-height-percent:0;mso-wrap-distance-left:9pt;mso-wrap-distance-top:0;mso-wrap-distance-right:9pt;mso-wrap-distance-bottom:0;mso-position-horizontal:absolute;mso-position-horizontal-relative:margin;mso-position-vertical:absolute;mso-position-vertical-relative:text;mso-width-percent:0;mso-height-percent:0;mso-width-relative:margin;mso-height-relative:margin;v-text-anchor:middle" coordsize="809625,304800" o:gfxdata="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" path="m,l809625,r,304800l,304800,,xm38100,38100r,228600l771525,266700r,-228600l38100,38100xe" fillcolor="red" strokecolor="red" strokeweight="1pt">
                 <v:stroke joinstyle="miter"/>
                 <v:path arrowok="t" o:connecttype="custom" o:connectlocs="0,0;809625,0;809625,304800;0,304800;0,0;38100,38100;38100,266700;771525,266700;771525,38100;38100,38100" o:connectangles="0,0,0,0,0,0,0,0,0,0"/>
                 <w10:wrap anchorx="margin"/>
@@ -5570,7 +5464,7 @@
           </mc:Choice>
           <mc:Fallback>
             <w:pict>
-              <v:shapetype w14:anchorId="773AA9F1" id="_x0000_t13" coordsize="21600,21600" o:spt="13" adj="16200,5400" path="m@0,l@0@1,0@1,0@2@0@2@0,21600,21600,10800xe">
+              <v:shapetype w14:anchorId="36E1D48F" id="_x0000_t13" coordsize="21600,21600" o:spt="13" adj="16200,5400" path="m@0,l@0@1,0@1,0@2@0@2@0,21600,21600,10800xe">
                 <v:stroke joinstyle="miter"/>
                 <v:formulas>
                   <v:f eqn="val #0"/>
@@ -5839,7 +5733,7 @@
           </mc:Choice>
           <mc:Fallback>
             <w:pict>
-              <v:rect w14:anchorId="4719D1FA" id="Rectangle 28" o:spid="_x0000_s1026" style="position:absolute;margin-left:189.2pt;margin-top:9.75pt;width:95.9pt;height:3.6pt;rotation:-90;flip:y;z-index:251693056;visibility:visible;mso-wrap-style:square;mso-width-percent:0;mso-height-percent:0;mso-wrap-distance-left:9pt;mso-wrap-distance-top:0;mso-wrap-distance-right:9pt;mso-wrap-distance-bottom:0;mso-position-horizontal:absolute;mso-position-horizontal-relative:text;mso-position-vertical:absolute;mso-position-vertical-relative:text;mso-width-percent:0;mso-height-percent:0;mso-width-relative:margin;mso-height-relative:margin;v-text-anchor:middle" o:gfxdata="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" fillcolor="red" strokecolor="red" strokeweight="1pt"/>
+              <v:rect w14:anchorId="7771E1CE" id="Rectangle 28" o:spid="_x0000_s1026" style="position:absolute;margin-left:189.2pt;margin-top:9.75pt;width:95.9pt;height:3.6pt;rotation:-90;flip:y;z-index:251693056;visibility:visible;mso-wrap-style:square;mso-width-percent:0;mso-height-percent:0;mso-wrap-distance-left:9pt;mso-wrap-distance-top:0;mso-wrap-distance-right:9pt;mso-wrap-distance-bottom:0;mso-position-horizontal:absolute;mso-position-horizontal-relative:text;mso-position-vertical:absolute;mso-position-vertical-relative:text;mso-width-percent:0;mso-height-percent:0;mso-width-relative:margin;mso-height-relative:margin;v-text-anchor:middle" o:gfxdata="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" fillcolor="red" strokecolor="red" strokeweight="1pt"/>
             </w:pict>
           </mc:Fallback>
         </mc:AlternateContent>
@@ -5912,7 +5806,7 @@
           </mc:Choice>
           <mc:Fallback>
             <w:pict>
-              <v:shape w14:anchorId="24E9FA0B" id="Straight Arrow Connector 24" o:spid="_x0000_s1026" type="#_x0000_t32" style="position:absolute;margin-left:55.5pt;margin-top:5.9pt;width:53.25pt;height:36pt;flip:x;z-index:251687936;visibility:visible;mso-wrap-style:square;mso-width-percent:0;mso-height-percent:0;mso-wrap-distance-left:9pt;mso-wrap-distance-top:0;mso-wrap-distance-right:9pt;mso-wrap-distance-bottom:0;mso-position-horizontal:absolute;mso-position-horizontal-relative:margin;mso-position-vertical:absolute;mso-position-vertical-relative:text;mso-width-percent:0;mso-height-percent:0;mso-width-relative:margin;mso-height-relative:margin" o:gfxdata="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" strokecolor="red" strokeweight=".5pt">
+              <v:shape w14:anchorId="01F39F68" id="Straight Arrow Connector 24" o:spid="_x0000_s1026" type="#_x0000_t32" style="position:absolute;margin-left:55.5pt;margin-top:5.9pt;width:53.25pt;height:36pt;flip:x;z-index:251687936;visibility:visible;mso-wrap-style:square;mso-width-percent:0;mso-height-percent:0;mso-wrap-distance-left:9pt;mso-wrap-distance-top:0;mso-wrap-distance-right:9pt;mso-wrap-distance-bottom:0;mso-position-horizontal:absolute;mso-position-horizontal-relative:margin;mso-position-vertical:absolute;mso-position-vertical-relative:text;mso-width-percent:0;mso-height-percent:0;mso-width-relative:margin;mso-height-relative:margin" o:gfxdata="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" strokecolor="red" strokeweight=".5pt">
                 <v:stroke endarrow="block" joinstyle="miter"/>
                 <w10:wrap anchorx="margin"/>
               </v:shape>
@@ -6009,7 +5903,7 @@
           </mc:Choice>
           <mc:Fallback>
             <w:pict>
-              <v:rect w14:anchorId="30268161" id="Rectangle 27" o:spid="_x0000_s1026" style="position:absolute;margin-left:63.75pt;margin-top:11.5pt;width:172.5pt;height:3.6pt;z-index:251691008;visibility:visible;mso-wrap-style:square;mso-height-percent:0;mso-wrap-distance-left:9pt;mso-wrap-distance-top:0;mso-wrap-distance-right:9pt;mso-wrap-distance-bottom:0;mso-position-horizontal:absolute;mso-position-horizontal-relative:text;mso-position-vertical:absolute;mso-position-vertical-relative:text;mso-height-percent:0;mso-height-relative:margin;v-text-anchor:middle" o:gfxdata="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" fillcolor="red" strokecolor="red" strokeweight="1pt"/>
+              <v:rect w14:anchorId="1D8857BC" id="Rectangle 27" o:spid="_x0000_s1026" style="position:absolute;margin-left:63.75pt;margin-top:11.5pt;width:172.5pt;height:3.6pt;z-index:251691008;visibility:visible;mso-wrap-style:square;mso-height-percent:0;mso-wrap-distance-left:9pt;mso-wrap-distance-top:0;mso-wrap-distance-right:9pt;mso-wrap-distance-bottom:0;mso-position-horizontal:absolute;mso-position-horizontal-relative:text;mso-position-vertical:absolute;mso-position-vertical-relative:text;mso-height-percent:0;mso-height-relative:margin;v-text-anchor:middle" o:gfxdata="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" fillcolor="red" strokecolor="red" strokeweight="1pt"/>
             </w:pict>
           </mc:Fallback>
         </mc:AlternateContent>
@@ -6091,7 +5985,7 @@
           </mc:Choice>
           <mc:Fallback>
             <w:pict>
-              <v:shape w14:anchorId="6A277586" id="Frame 23" o:spid="_x0000_s1026" style="position:absolute;margin-left:0;margin-top:4pt;width:63.75pt;height:24pt;z-index:251685888;visibility:visible;mso-wrap-style:square;mso-width-percent:0;mso-height-percent:0;mso-wrap-distance-left:9pt;mso-wrap-distance-top:0;mso-wrap-distance-right:9pt;mso-wrap-distance-bottom:0;mso-position-horizontal:left;mso-position-horizontal-relative:margin;mso-position-vertical:absolute;mso-position-vertical-relative:text;mso-width-percent:0;mso-height-percent:0;mso-width-relative:margin;mso-height-relative:margin;v-text-anchor:middle" coordsize="809625,304800" o:gfxdata="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" path="m,l809625,r,304800l,304800,,xm38100,38100r,228600l771525,266700r,-228600l38100,38100xe" fillcolor="red" strokecolor="red" strokeweight="1pt">
+              <v:shape w14:anchorId="5CBEF3BA" id="Frame 23" o:spid="_x0000_s1026" style="position:absolute;margin-left:0;margin-top:4pt;width:63.75pt;height:24pt;z-index:251685888;visibility:visible;mso-wrap-style:square;mso-width-percent:0;mso-height-percent:0;mso-wrap-distance-left:9pt;mso-wrap-distance-top:0;mso-wrap-distance-right:9pt;mso-wrap-distance-bottom:0;mso-position-horizontal:left;mso-position-horizontal-relative:margin;mso-position-vertical:absolute;mso-position-vertical-relative:text;mso-width-percent:0;mso-height-percent:0;mso-width-relative:margin;mso-height-relative:margin;v-text-anchor:middle" coordsize="809625,304800" o:gfxdata="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" path="m,l809625,r,304800l,304800,,xm38100,38100r,228600l771525,266700r,-228600l38100,38100xe" fillcolor="red" strokecolor="red" strokeweight="1pt">
                 <v:stroke joinstyle="miter"/>
                 <v:path arrowok="t" o:connecttype="custom" o:connectlocs="0,0;809625,0;809625,304800;0,304800;0,0;38100,38100;38100,266700;771525,266700;771525,38100;38100,38100" o:connectangles="0,0,0,0,0,0,0,0,0,0"/>
                 <w10:wrap anchorx="margin"/>
@@ -7078,7 +6972,7 @@
           </mc:Choice>
           <mc:Fallback>
             <w:pict>
-              <v:shape w14:anchorId="280CF398" id="Frame 36" o:spid="_x0000_s1026" style="position:absolute;margin-left:167.25pt;margin-top:28.05pt;width:93pt;height:27.75pt;z-index:251704320;visibility:visible;mso-wrap-style:square;mso-width-percent:0;mso-height-percent:0;mso-wrap-distance-left:9pt;mso-wrap-distance-top:0;mso-wrap-distance-right:9pt;mso-wrap-distance-bottom:0;mso-position-horizontal:absolute;mso-position-horizontal-relative:margin;mso-position-vertical:absolute;mso-position-vertical-relative:text;mso-width-percent:0;mso-height-percent:0;mso-width-relative:margin;mso-height-relative:margin;v-text-anchor:middle" coordsize="1181100,352425" o:gfxdata="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" path="m,l1181100,r,352425l,352425,,xm44053,44053r,264319l1137047,308372r,-264319l44053,44053xe" fillcolor="red" strokecolor="red" strokeweight="1pt">
+              <v:shape w14:anchorId="0BCB09E7" id="Frame 36" o:spid="_x0000_s1026" style="position:absolute;margin-left:167.25pt;margin-top:28.05pt;width:93pt;height:27.75pt;z-index:251704320;visibility:visible;mso-wrap-style:square;mso-width-percent:0;mso-height-percent:0;mso-wrap-distance-left:9pt;mso-wrap-distance-top:0;mso-wrap-distance-right:9pt;mso-wrap-distance-bottom:0;mso-position-horizontal:absolute;mso-position-horizontal-relative:margin;mso-position-vertical:absolute;mso-position-vertical-relative:text;mso-width-percent:0;mso-height-percent:0;mso-width-relative:margin;mso-height-relative:margin;v-text-anchor:middle" coordsize="1181100,352425" o:gfxdata="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" path="m,l1181100,r,352425l,352425,,xm44053,44053r,264319l1137047,308372r,-264319l44053,44053xe" fillcolor="red" strokecolor="red" strokeweight="1pt">
                 <v:stroke joinstyle="miter"/>
                 <v:path arrowok="t" o:connecttype="custom" o:connectlocs="0,0;1181100,0;1181100,352425;0,352425;0,0;44053,44053;44053,308372;1137047,308372;1137047,44053;44053,44053" o:connectangles="0,0,0,0,0,0,0,0,0,0"/>
                 <w10:wrap anchorx="margin"/>
@@ -7399,7 +7293,7 @@
           </mc:Choice>
           <mc:Fallback>
             <w:pict>
-              <v:shape w14:anchorId="7D00EEC6" id="Frame 37" o:spid="_x0000_s1026" style="position:absolute;margin-left:242.25pt;margin-top:52.7pt;width:49.5pt;height:26.25pt;z-index:251706368;visibility:visible;mso-wrap-style:square;mso-width-percent:0;mso-height-percent:0;mso-wrap-distance-left:9pt;mso-wrap-distance-top:0;mso-wrap-distance-right:9pt;mso-wrap-distance-bottom:0;mso-position-horizontal:absolute;mso-position-horizontal-relative:margin;mso-position-vertical:absolute;mso-position-vertical-relative:text;mso-width-percent:0;mso-height-percent:0;mso-width-relative:margin;mso-height-relative:margin;v-text-anchor:middle" coordsize="628650,333375" o:gfxdata="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" path="m,l628650,r,333375l,333375,,xm41672,41672r,250031l586978,291703r,-250031l41672,41672xe" fillcolor="red" strokecolor="red" strokeweight="1pt">
+              <v:shape w14:anchorId="07552F0E" id="Frame 37" o:spid="_x0000_s1026" style="position:absolute;margin-left:242.25pt;margin-top:52.7pt;width:49.5pt;height:26.25pt;z-index:251706368;visibility:visible;mso-wrap-style:square;mso-width-percent:0;mso-height-percent:0;mso-wrap-distance-left:9pt;mso-wrap-distance-top:0;mso-wrap-distance-right:9pt;mso-wrap-distance-bottom:0;mso-position-horizontal:absolute;mso-position-horizontal-relative:margin;mso-position-vertical:absolute;mso-position-vertical-relative:text;mso-width-percent:0;mso-height-percent:0;mso-width-relative:margin;mso-height-relative:margin;v-text-anchor:middle" coordsize="628650,333375" o:gfxdata="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" path="m,l628650,r,333375l,333375,,xm41672,41672r,250031l586978,291703r,-250031l41672,41672xe" fillcolor="red" strokecolor="red" strokeweight="1pt">
                 <v:stroke joinstyle="miter"/>
                 <v:path arrowok="t" o:connecttype="custom" o:connectlocs="0,0;628650,0;628650,333375;0,333375;0,0;41672,41672;41672,291703;586978,291703;586978,41672;41672,41672" o:connectangles="0,0,0,0,0,0,0,0,0,0"/>
                 <w10:wrap anchorx="margin"/>
@@ -7754,7 +7648,7 @@
           </mc:Choice>
           <mc:Fallback>
             <w:pict>
-              <v:shape w14:anchorId="6DF6C508" id="Frame 38" o:spid="_x0000_s1026" style="position:absolute;margin-left:359.25pt;margin-top:16.2pt;width:54.75pt;height:21.75pt;z-index:251708416;visibility:visible;mso-wrap-style:square;mso-width-percent:0;mso-height-percent:0;mso-wrap-distance-left:9pt;mso-wrap-distance-top:0;mso-wrap-distance-right:9pt;mso-wrap-distance-bottom:0;mso-position-horizontal:absolute;mso-position-horizontal-relative:margin;mso-position-vertical:absolute;mso-position-vertical-relative:text;mso-width-percent:0;mso-height-percent:0;mso-width-relative:margin;mso-height-relative:margin;v-text-anchor:middle" coordsize="695325,276225" o:gfxdata="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" path="m,l695325,r,276225l,276225,,xm34528,34528r,207169l660797,241697r,-207169l34528,34528xe" fillcolor="red" strokecolor="red" strokeweight="1pt">
+              <v:shape w14:anchorId="4F7A2B30" id="Frame 38" o:spid="_x0000_s1026" style="position:absolute;margin-left:359.25pt;margin-top:16.2pt;width:54.75pt;height:21.75pt;z-index:251708416;visibility:visible;mso-wrap-style:square;mso-width-percent:0;mso-height-percent:0;mso-wrap-distance-left:9pt;mso-wrap-distance-top:0;mso-wrap-distance-right:9pt;mso-wrap-distance-bottom:0;mso-position-horizontal:absolute;mso-position-horizontal-relative:margin;mso-position-vertical:absolute;mso-position-vertical-relative:text;mso-width-percent:0;mso-height-percent:0;mso-width-relative:margin;mso-height-relative:margin;v-text-anchor:middle" coordsize="695325,276225" o:gfxdata="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" path="m,l695325,r,276225l,276225,,xm34528,34528r,207169l660797,241697r,-207169l34528,34528xe" fillcolor="red" strokecolor="red" strokeweight="1pt">
                 <v:stroke joinstyle="miter"/>
                 <v:path arrowok="t" o:connecttype="custom" o:connectlocs="0,0;695325,0;695325,276225;0,276225;0,0;34528,34528;34528,241697;660797,241697;660797,34528;34528,34528" o:connectangles="0,0,0,0,0,0,0,0,0,0"/>
                 <w10:wrap anchorx="margin"/>
@@ -7930,7 +7824,7 @@
           </mc:Choice>
           <mc:Fallback>
             <w:pict>
-              <v:shape w14:anchorId="5C4BDB5D" id="Frame 44" o:spid="_x0000_s1026" style="position:absolute;margin-left:0;margin-top:91.75pt;width:424.5pt;height:16.5pt;z-index:251717632;visibility:visible;mso-wrap-style:square;mso-width-percent:0;mso-height-percent:0;mso-wrap-distance-left:9pt;mso-wrap-distance-top:0;mso-wrap-distance-right:9pt;mso-wrap-distance-bottom:0;mso-position-horizontal:left;mso-position-horizontal-relative:margin;mso-position-vertical:absolute;mso-position-vertical-relative:text;mso-width-percent:0;mso-height-percent:0;mso-width-relative:margin;mso-height-relative:margin;v-text-anchor:middle" coordsize="5391150,209550" o:gfxdata="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" path="m,l5391150,r,209550l,209550,,xm26194,26194r,157162l5364956,183356r,-157162l26194,26194xe" fillcolor="red" strokecolor="red" strokeweight="1pt">
+              <v:shape w14:anchorId="6D539B5F" id="Frame 44" o:spid="_x0000_s1026" style="position:absolute;margin-left:0;margin-top:91.75pt;width:424.5pt;height:16.5pt;z-index:251717632;visibility:visible;mso-wrap-style:square;mso-width-percent:0;mso-height-percent:0;mso-wrap-distance-left:9pt;mso-wrap-distance-top:0;mso-wrap-distance-right:9pt;mso-wrap-distance-bottom:0;mso-position-horizontal:left;mso-position-horizontal-relative:margin;mso-position-vertical:absolute;mso-position-vertical-relative:text;mso-width-percent:0;mso-height-percent:0;mso-width-relative:margin;mso-height-relative:margin;v-text-anchor:middle" coordsize="5391150,209550" o:gfxdata="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" path="m,l5391150,r,209550l,209550,,xm26194,26194r,157162l5364956,183356r,-157162l26194,26194xe" fillcolor="red" strokecolor="red" strokeweight="1pt">
                 <v:stroke joinstyle="miter"/>
                 <v:path arrowok="t" o:connecttype="custom" o:connectlocs="0,0;5391150,0;5391150,209550;0,209550;0,0;26194,26194;26194,183356;5364956,183356;5364956,26194;26194,26194" o:connectangles="0,0,0,0,0,0,0,0,0,0"/>
                 <w10:wrap anchorx="margin"/>
@@ -8154,7 +8048,7 @@
           </mc:Choice>
           <mc:Fallback>
             <w:pict>
-              <v:shape w14:anchorId="01078513" id="Frame 48" o:spid="_x0000_s1026" style="position:absolute;margin-left:4.5pt;margin-top:73.95pt;width:453pt;height:17.25pt;z-index:251723776;visibility:visible;mso-wrap-style:square;mso-width-percent:0;mso-height-percent:0;mso-wrap-distance-left:9pt;mso-wrap-distance-top:0;mso-wrap-distance-right:9pt;mso-wrap-distance-bottom:0;mso-position-horizontal:absolute;mso-position-horizontal-relative:margin;mso-position-vertical:absolute;mso-position-vertical-relative:text;mso-width-percent:0;mso-height-percent:0;mso-width-relative:margin;mso-height-relative:margin;v-text-anchor:middle" coordsize="5753100,219075" o:gfxdata="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" path="m,l5753100,r,219075l,219075,,xm27384,27384r,164307l5725716,191691r,-164307l27384,27384xe" fillcolor="red" strokecolor="red" strokeweight="1pt">
+              <v:shape w14:anchorId="687288D8" id="Frame 48" o:spid="_x0000_s1026" style="position:absolute;margin-left:4.5pt;margin-top:73.95pt;width:453pt;height:17.25pt;z-index:251723776;visibility:visible;mso-wrap-style:square;mso-width-percent:0;mso-height-percent:0;mso-wrap-distance-left:9pt;mso-wrap-distance-top:0;mso-wrap-distance-right:9pt;mso-wrap-distance-bottom:0;mso-position-horizontal:absolute;mso-position-horizontal-relative:margin;mso-position-vertical:absolute;mso-position-vertical-relative:text;mso-width-percent:0;mso-height-percent:0;mso-width-relative:margin;mso-height-relative:margin;v-text-anchor:middle" coordsize="5753100,219075" o:gfxdata="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" path="m,l5753100,r,219075l,219075,,xm27384,27384r,164307l5725716,191691r,-164307l27384,27384xe" fillcolor="red" strokecolor="red" strokeweight="1pt">
                 <v:stroke joinstyle="miter"/>
                 <v:path arrowok="t" o:connecttype="custom" o:connectlocs="0,0;5753100,0;5753100,219075;0,219075;0,0;27384,27384;27384,191691;5725716,191691;5725716,27384;27384,27384" o:connectangles="0,0,0,0,0,0,0,0,0,0"/>
                 <w10:wrap anchorx="margin"/>
@@ -8400,23 +8294,7 @@
           <w:rFonts w:asciiTheme="minorHAnsi" w:hAnsiTheme="minorHAnsi"/>
           <w:color w:val="000000"/>
         </w:rPr>
-        <w:t xml:space="preserve">Open Git Bash: Right-click inside your </w:t>
-      </w:r>
-      <w:proofErr w:type="spellStart"/>
-      <w:r>
-        <w:rPr>
-          <w:rFonts w:asciiTheme="minorHAnsi" w:hAnsiTheme="minorHAnsi"/>
-          <w:color w:val="000000"/>
-        </w:rPr>
-        <w:t>oakridge_library_database_project</w:t>
-      </w:r>
-      <w:proofErr w:type="spellEnd"/>
-      <w:r>
-        <w:rPr>
-          <w:rFonts w:asciiTheme="minorHAnsi" w:hAnsiTheme="minorHAnsi"/>
-          <w:color w:val="000000"/>
-        </w:rPr>
-        <w:t xml:space="preserve"> folder and select "Open Git Bash Here."</w:t>
+        <w:t>Open Git Bash: Right-click inside your oakridge_library_database_project folder and select "Open Git Bash Here."</w:t>
       </w:r>
     </w:p>
     <w:p>
@@ -8623,31 +8501,7 @@
           <w:szCs w:val="27"/>
           <w:u w:val="single"/>
         </w:rPr>
-        <w:t xml:space="preserve">Step 4: Initialize Git (git </w:t>
-      </w:r>
-      <w:proofErr w:type="spellStart"/>
-      <w:r>
-        <w:rPr>
-          <w:b/>
-          <w:bCs/>
-          <w:color w:val="000000"/>
-          <w:sz w:val="27"/>
-          <w:szCs w:val="27"/>
-          <w:u w:val="single"/>
-        </w:rPr>
-        <w:t>init</w:t>
-      </w:r>
-      <w:proofErr w:type="spellEnd"/>
-      <w:r>
-        <w:rPr>
-          <w:b/>
-          <w:bCs/>
-          <w:color w:val="000000"/>
-          <w:sz w:val="27"/>
-          <w:szCs w:val="27"/>
-          <w:u w:val="single"/>
-        </w:rPr>
-        <w:t>)</w:t>
+        <w:t>Step 4: Initialize Git (git init)</w:t>
       </w:r>
     </w:p>
     <w:p>
@@ -8746,20 +8600,8 @@
           <w:sz w:val="24"/>
           <w:szCs w:val="24"/>
         </w:rPr>
-        <w:t xml:space="preserve">git </w:t>
-      </w:r>
-      <w:proofErr w:type="spellStart"/>
-      <w:r>
-        <w:rPr>
-          <w:b/>
-          <w:bCs/>
-          <w:color w:val="000000"/>
-          <w:sz w:val="24"/>
-          <w:szCs w:val="24"/>
-        </w:rPr>
-        <w:t>init</w:t>
-      </w:r>
-      <w:proofErr w:type="spellEnd"/>
+        <w:t>git init</w:t>
+      </w:r>
     </w:p>
     <w:p>
       <w:pPr>
@@ -8862,17 +8704,8 @@
           <w:rFonts w:asciiTheme="minorHAnsi" w:hAnsiTheme="minorHAnsi"/>
           <w:color w:val="000000"/>
         </w:rPr>
-        <w:t xml:space="preserve">Which files are untracked (new files that Git is not yet </w:t>
-      </w:r>
-      <w:proofErr w:type="gramStart"/>
-      <w:r>
-        <w:rPr>
-          <w:rFonts w:asciiTheme="minorHAnsi" w:hAnsiTheme="minorHAnsi"/>
-          <w:color w:val="000000"/>
-        </w:rPr>
-        <w:t>tracking)</w:t>
-      </w:r>
-      <w:proofErr w:type="gramEnd"/>
+        <w:t>Which files are untracked (new files that Git is not yet tracking)</w:t>
+      </w:r>
     </w:p>
     <w:p>
       <w:pPr>
@@ -8892,17 +8725,8 @@
           <w:rFonts w:asciiTheme="minorHAnsi" w:hAnsiTheme="minorHAnsi"/>
           <w:color w:val="000000"/>
         </w:rPr>
-        <w:t xml:space="preserve">Which files have been modified since the last </w:t>
-      </w:r>
-      <w:proofErr w:type="gramStart"/>
-      <w:r>
-        <w:rPr>
-          <w:rFonts w:asciiTheme="minorHAnsi" w:hAnsiTheme="minorHAnsi"/>
-          <w:color w:val="000000"/>
-        </w:rPr>
-        <w:t>commit</w:t>
-      </w:r>
-      <w:proofErr w:type="gramEnd"/>
+        <w:t>Which files have been modified since the last commit</w:t>
+      </w:r>
     </w:p>
     <w:p>
       <w:pPr>
@@ -9051,31 +8875,7 @@
           <w:szCs w:val="27"/>
           <w:u w:val="single"/>
         </w:rPr>
-        <w:t xml:space="preserve">Step 6: Add Files to Staging Area (git </w:t>
-      </w:r>
-      <w:proofErr w:type="gramStart"/>
-      <w:r>
-        <w:rPr>
-          <w:b/>
-          <w:bCs/>
-          <w:color w:val="000000"/>
-          <w:sz w:val="27"/>
-          <w:szCs w:val="27"/>
-          <w:u w:val="single"/>
-        </w:rPr>
-        <w:t>add .</w:t>
-      </w:r>
-      <w:proofErr w:type="gramEnd"/>
-      <w:r>
-        <w:rPr>
-          <w:b/>
-          <w:bCs/>
-          <w:color w:val="000000"/>
-          <w:sz w:val="27"/>
-          <w:szCs w:val="27"/>
-          <w:u w:val="single"/>
-        </w:rPr>
-        <w:t>)</w:t>
+        <w:t>Step 6: Add Files to Staging Area (git add .)</w:t>
       </w:r>
     </w:p>
     <w:p>
@@ -9101,19 +8901,8 @@
           <w:bCs/>
           <w:color w:val="000000"/>
         </w:rPr>
-        <w:t xml:space="preserve">git </w:t>
-      </w:r>
-      <w:proofErr w:type="gramStart"/>
-      <w:r>
-        <w:rPr>
-          <w:rFonts w:asciiTheme="minorHAnsi" w:hAnsiTheme="minorHAnsi"/>
-          <w:b/>
-          <w:bCs/>
-          <w:color w:val="000000"/>
-        </w:rPr>
-        <w:t>add .</w:t>
-      </w:r>
-      <w:proofErr w:type="gramEnd"/>
+        <w:t>git add .</w:t>
+      </w:r>
     </w:p>
     <w:p>
       <w:pPr>
@@ -9127,21 +8916,12 @@
           <w:color w:val="000000"/>
         </w:rPr>
       </w:pPr>
-      <w:proofErr w:type="gramStart"/>
       <w:r>
         <w:rPr>
           <w:rFonts w:asciiTheme="minorHAnsi" w:hAnsiTheme="minorHAnsi"/>
           <w:color w:val="000000"/>
         </w:rPr>
-        <w:t>The .</w:t>
-      </w:r>
-      <w:proofErr w:type="gramEnd"/>
-      <w:r>
-        <w:rPr>
-          <w:rFonts w:asciiTheme="minorHAnsi" w:hAnsiTheme="minorHAnsi"/>
-          <w:color w:val="000000"/>
-        </w:rPr>
-        <w:t xml:space="preserve"> (dot) adds all files and subfolders in the current directory to the staging area.</w:t>
+        <w:t>The . (dot) adds all files and subfolders in the current directory to the staging area.</w:t>
       </w:r>
     </w:p>
     <w:p>
@@ -9250,9 +9030,8 @@
           <w:bCs/>
           <w:color w:val="000000"/>
         </w:rPr>
-        <w:t xml:space="preserve">git add </w:t>
-      </w:r>
-      <w:proofErr w:type="gramStart"/>
+        <w:t>git add Oakridge_Data_Dictionary.xlsx</w:t>
+      </w:r>
       <w:r>
         <w:rPr>
           <w:rFonts w:asciiTheme="minorHAnsi" w:hAnsiTheme="minorHAnsi"/>
@@ -9260,26 +9039,7 @@
           <w:bCs/>
           <w:color w:val="000000"/>
         </w:rPr>
-        <w:t>Oakridge_Data_Dictionary.xlsx</w:t>
-      </w:r>
-      <w:r>
-        <w:rPr>
-          <w:rFonts w:asciiTheme="minorHAnsi" w:hAnsiTheme="minorHAnsi"/>
-          <w:b/>
-          <w:bCs/>
-          <w:color w:val="000000"/>
-        </w:rPr>
-        <w:t xml:space="preserve"> ,</w:t>
-      </w:r>
-      <w:proofErr w:type="gramEnd"/>
-      <w:r>
-        <w:rPr>
-          <w:rFonts w:asciiTheme="minorHAnsi" w:hAnsiTheme="minorHAnsi"/>
-          <w:b/>
-          <w:bCs/>
-          <w:color w:val="000000"/>
-        </w:rPr>
-        <w:t xml:space="preserve"> </w:t>
+        <w:t xml:space="preserve"> , </w:t>
       </w:r>
       <w:r>
         <w:rPr>
@@ -9357,11 +9117,379 @@
       </w:pPr>
       <w:r>
         <w:rPr>
+          <w:noProof/>
+        </w:rPr>
+        <w:drawing>
+          <wp:anchor distT="0" distB="0" distL="114300" distR="114300" simplePos="0" relativeHeight="251729920" behindDoc="1" locked="0" layoutInCell="1" allowOverlap="1" wp14:anchorId="6E46A368" wp14:editId="33CC3FA9">
+            <wp:simplePos x="0" y="0"/>
+            <wp:positionH relativeFrom="margin">
+              <wp:align>left</wp:align>
+            </wp:positionH>
+            <wp:positionV relativeFrom="paragraph">
+              <wp:posOffset>424815</wp:posOffset>
+            </wp:positionV>
+            <wp:extent cx="5772150" cy="1409700"/>
+            <wp:effectExtent l="0" t="0" r="0" b="0"/>
+            <wp:wrapTight wrapText="bothSides">
+              <wp:wrapPolygon edited="0">
+                <wp:start x="0" y="0"/>
+                <wp:lineTo x="0" y="21308"/>
+                <wp:lineTo x="21529" y="21308"/>
+                <wp:lineTo x="21529" y="0"/>
+                <wp:lineTo x="0" y="0"/>
+              </wp:wrapPolygon>
+            </wp:wrapTight>
+            <wp:docPr id="54" name="Picture 54"/>
+            <wp:cNvGraphicFramePr>
+              <a:graphicFrameLocks xmlns:a="http://schemas.openxmlformats.org/drawingml/2006/main" noChangeAspect="1"/>
+            </wp:cNvGraphicFramePr>
+            <a:graphic xmlns:a="http://schemas.openxmlformats.org/drawingml/2006/main">
+              <a:graphicData uri="http://schemas.openxmlformats.org/drawingml/2006/picture">
+                <pic:pic xmlns:pic="http://schemas.openxmlformats.org/drawingml/2006/picture">
+                  <pic:nvPicPr>
+                    <pic:cNvPr id="1" name=""/>
+                    <pic:cNvPicPr/>
+                  </pic:nvPicPr>
+                  <pic:blipFill>
+                    <a:blip r:embed="rId33">
+                      <a:extLst>
+                        <a:ext uri="{28A0092B-C50C-407E-A947-70E740481C1C}">
+                          <a14:useLocalDpi xmlns:a14="http://schemas.microsoft.com/office/drawing/2010/main" val="0"/>
+                        </a:ext>
+                      </a:extLst>
+                    </a:blip>
+                    <a:stretch>
+                      <a:fillRect/>
+                    </a:stretch>
+                  </pic:blipFill>
+                  <pic:spPr>
+                    <a:xfrm>
+                      <a:off x="0" y="0"/>
+                      <a:ext cx="5772150" cy="1409700"/>
+                    </a:xfrm>
+                    <a:prstGeom prst="rect">
+                      <a:avLst/>
+                    </a:prstGeom>
+                  </pic:spPr>
+                </pic:pic>
+              </a:graphicData>
+            </a:graphic>
+            <wp14:sizeRelH relativeFrom="margin">
+              <wp14:pctWidth>0</wp14:pctWidth>
+            </wp14:sizeRelH>
+            <wp14:sizeRelV relativeFrom="margin">
+              <wp14:pctHeight>0</wp14:pctHeight>
+            </wp14:sizeRelV>
+          </wp:anchor>
+        </w:drawing>
+      </w:r>
+      <w:r>
+        <w:rPr>
           <w:rFonts w:asciiTheme="minorHAnsi" w:hAnsiTheme="minorHAnsi"/>
           <w:color w:val="000000"/>
         </w:rPr>
         <w:t>Use this command: git commit -m "Commit Message"</w:t>
       </w:r>
+    </w:p>
+    <w:p>
+      <w:pPr>
+        <w:pStyle w:val="ListParagraph"/>
+        <w:numPr>
+          <w:ilvl w:val="0"/>
+          <w:numId w:val="19"/>
+        </w:numPr>
+        <w:rPr>
+          <w:rFonts w:ascii="Montserrat" w:hAnsi="Montserrat"/>
+          <w:b/>
+          <w:bCs/>
+          <w:u w:val="single"/>
+        </w:rPr>
+      </w:pPr>
+      <w:r>
+        <w:rPr>
+          <w:b/>
+          <w:bCs/>
+          <w:color w:val="000000"/>
+          <w:sz w:val="27"/>
+          <w:szCs w:val="27"/>
+          <w:u w:val="single"/>
+        </w:rPr>
+        <w:lastRenderedPageBreak/>
+        <w:t>Step 8: Connect to a remote repository (GitHub, GitLab, etc.)</w:t>
+      </w:r>
+    </w:p>
+    <w:p>
+      <w:pPr>
+        <w:rPr>
+          <w:rFonts w:ascii="Montserrat" w:hAnsi="Montserrat"/>
+          <w:lang w:val="en-MY"/>
+        </w:rPr>
+      </w:pPr>
+    </w:p>
+    <w:p>
+      <w:pPr>
+        <w:rPr>
+          <w:rFonts w:ascii="Montserrat" w:hAnsi="Montserrat"/>
+          <w:lang w:val="en-MY"/>
+        </w:rPr>
+      </w:pPr>
+      <w:r>
+        <w:rPr>
+          <w:noProof/>
+        </w:rPr>
+        <w:drawing>
+          <wp:inline distT="0" distB="0" distL="0" distR="0" wp14:anchorId="483E0228" wp14:editId="0DE588C8">
+            <wp:extent cx="3028950" cy="2419350"/>
+            <wp:effectExtent l="0" t="0" r="0" b="0"/>
+            <wp:docPr id="55" name="Picture 55"/>
+            <wp:cNvGraphicFramePr>
+              <a:graphicFrameLocks xmlns:a="http://schemas.openxmlformats.org/drawingml/2006/main" noChangeAspect="1"/>
+            </wp:cNvGraphicFramePr>
+            <a:graphic xmlns:a="http://schemas.openxmlformats.org/drawingml/2006/main">
+              <a:graphicData uri="http://schemas.openxmlformats.org/drawingml/2006/picture">
+                <pic:pic xmlns:pic="http://schemas.openxmlformats.org/drawingml/2006/picture">
+                  <pic:nvPicPr>
+                    <pic:cNvPr id="1" name=""/>
+                    <pic:cNvPicPr/>
+                  </pic:nvPicPr>
+                  <pic:blipFill>
+                    <a:blip r:embed="rId34"/>
+                    <a:stretch>
+                      <a:fillRect/>
+                    </a:stretch>
+                  </pic:blipFill>
+                  <pic:spPr>
+                    <a:xfrm>
+                      <a:off x="0" y="0"/>
+                      <a:ext cx="3028950" cy="2419350"/>
+                    </a:xfrm>
+                    <a:prstGeom prst="rect">
+                      <a:avLst/>
+                    </a:prstGeom>
+                  </pic:spPr>
+                </pic:pic>
+              </a:graphicData>
+            </a:graphic>
+          </wp:inline>
+        </w:drawing>
+      </w:r>
+    </w:p>
+    <w:p>
+      <w:pPr>
+        <w:rPr>
+          <w:rFonts w:ascii="Montserrat" w:hAnsi="Montserrat"/>
+          <w:lang w:val="en-MY"/>
+        </w:rPr>
+      </w:pPr>
+    </w:p>
+    <w:p>
+      <w:pPr>
+        <w:rPr>
+          <w:rFonts w:ascii="Montserrat" w:hAnsi="Montserrat"/>
+          <w:lang w:val="en-MY"/>
+        </w:rPr>
+      </w:pPr>
+    </w:p>
+    <w:p>
+      <w:pPr>
+        <w:rPr>
+          <w:rFonts w:ascii="Montserrat" w:hAnsi="Montserrat"/>
+          <w:lang w:val="en-MY"/>
+        </w:rPr>
+      </w:pPr>
+      <w:r>
+        <w:rPr>
+          <w:noProof/>
+        </w:rPr>
+        <w:drawing>
+          <wp:inline distT="0" distB="0" distL="0" distR="0" wp14:anchorId="509FB41C" wp14:editId="01F0C6FB">
+            <wp:extent cx="5731510" cy="2821940"/>
+            <wp:effectExtent l="0" t="0" r="2540" b="0"/>
+            <wp:docPr id="56" name="Picture 56"/>
+            <wp:cNvGraphicFramePr>
+              <a:graphicFrameLocks xmlns:a="http://schemas.openxmlformats.org/drawingml/2006/main" noChangeAspect="1"/>
+            </wp:cNvGraphicFramePr>
+            <a:graphic xmlns:a="http://schemas.openxmlformats.org/drawingml/2006/main">
+              <a:graphicData uri="http://schemas.openxmlformats.org/drawingml/2006/picture">
+                <pic:pic xmlns:pic="http://schemas.openxmlformats.org/drawingml/2006/picture">
+                  <pic:nvPicPr>
+                    <pic:cNvPr id="1" name=""/>
+                    <pic:cNvPicPr/>
+                  </pic:nvPicPr>
+                  <pic:blipFill>
+                    <a:blip r:embed="rId35"/>
+                    <a:stretch>
+                      <a:fillRect/>
+                    </a:stretch>
+                  </pic:blipFill>
+                  <pic:spPr>
+                    <a:xfrm>
+                      <a:off x="0" y="0"/>
+                      <a:ext cx="5731510" cy="2821940"/>
+                    </a:xfrm>
+                    <a:prstGeom prst="rect">
+                      <a:avLst/>
+                    </a:prstGeom>
+                  </pic:spPr>
+                </pic:pic>
+              </a:graphicData>
+            </a:graphic>
+          </wp:inline>
+        </w:drawing>
+      </w:r>
+    </w:p>
+    <w:p>
+      <w:pPr>
+        <w:rPr>
+          <w:rFonts w:ascii="Montserrat" w:hAnsi="Montserrat"/>
+          <w:lang w:val="en-MY"/>
+        </w:rPr>
+      </w:pPr>
+    </w:p>
+    <w:p>
+      <w:pPr>
+        <w:rPr>
+          <w:rFonts w:ascii="Montserrat" w:hAnsi="Montserrat"/>
+          <w:lang w:val="en-MY"/>
+        </w:rPr>
+      </w:pPr>
+    </w:p>
+    <w:p>
+      <w:pPr>
+        <w:rPr>
+          <w:rFonts w:ascii="Montserrat" w:hAnsi="Montserrat"/>
+          <w:lang w:val="en-MY"/>
+        </w:rPr>
+      </w:pPr>
+    </w:p>
+    <w:p>
+      <w:pPr>
+        <w:rPr>
+          <w:rFonts w:ascii="Montserrat" w:hAnsi="Montserrat"/>
+          <w:lang w:val="en-MY"/>
+        </w:rPr>
+      </w:pPr>
+    </w:p>
+    <w:p>
+      <w:pPr>
+        <w:rPr>
+          <w:rFonts w:ascii="Montserrat" w:hAnsi="Montserrat"/>
+          <w:lang w:val="en-MY"/>
+        </w:rPr>
+      </w:pPr>
+      <w:r>
+        <w:rPr>
+          <w:noProof/>
+        </w:rPr>
+        <w:lastRenderedPageBreak/>
+        <w:drawing>
+          <wp:inline distT="0" distB="0" distL="0" distR="0" wp14:anchorId="615FEDEE" wp14:editId="13557486">
+            <wp:extent cx="5731510" cy="3281680"/>
+            <wp:effectExtent l="0" t="0" r="2540" b="0"/>
+            <wp:docPr id="57" name="Picture 57"/>
+            <wp:cNvGraphicFramePr>
+              <a:graphicFrameLocks xmlns:a="http://schemas.openxmlformats.org/drawingml/2006/main" noChangeAspect="1"/>
+            </wp:cNvGraphicFramePr>
+            <a:graphic xmlns:a="http://schemas.openxmlformats.org/drawingml/2006/main">
+              <a:graphicData uri="http://schemas.openxmlformats.org/drawingml/2006/picture">
+                <pic:pic xmlns:pic="http://schemas.openxmlformats.org/drawingml/2006/picture">
+                  <pic:nvPicPr>
+                    <pic:cNvPr id="1" name=""/>
+                    <pic:cNvPicPr/>
+                  </pic:nvPicPr>
+                  <pic:blipFill>
+                    <a:blip r:embed="rId36"/>
+                    <a:stretch>
+                      <a:fillRect/>
+                    </a:stretch>
+                  </pic:blipFill>
+                  <pic:spPr>
+                    <a:xfrm>
+                      <a:off x="0" y="0"/>
+                      <a:ext cx="5731510" cy="3281680"/>
+                    </a:xfrm>
+                    <a:prstGeom prst="rect">
+                      <a:avLst/>
+                    </a:prstGeom>
+                  </pic:spPr>
+                </pic:pic>
+              </a:graphicData>
+            </a:graphic>
+          </wp:inline>
+        </w:drawing>
+      </w:r>
+    </w:p>
+    <w:p>
+      <w:pPr>
+        <w:rPr>
+          <w:rFonts w:ascii="Montserrat" w:hAnsi="Montserrat"/>
+          <w:lang w:val="en-MY"/>
+        </w:rPr>
+      </w:pPr>
+    </w:p>
+    <w:p>
+      <w:pPr>
+        <w:rPr>
+          <w:rFonts w:ascii="Montserrat" w:hAnsi="Montserrat"/>
+          <w:lang w:val="en-MY"/>
+        </w:rPr>
+      </w:pPr>
+    </w:p>
+    <w:p>
+      <w:pPr>
+        <w:rPr>
+          <w:rFonts w:ascii="Montserrat" w:hAnsi="Montserrat"/>
+          <w:lang w:val="en-MY"/>
+        </w:rPr>
+      </w:pPr>
+      <w:r>
+        <w:rPr>
+          <w:noProof/>
+        </w:rPr>
+        <w:drawing>
+          <wp:inline distT="0" distB="0" distL="0" distR="0" wp14:anchorId="3522D025" wp14:editId="7B13EF3D">
+            <wp:extent cx="5731510" cy="849630"/>
+            <wp:effectExtent l="0" t="0" r="2540" b="7620"/>
+            <wp:docPr id="58" name="Picture 58"/>
+            <wp:cNvGraphicFramePr>
+              <a:graphicFrameLocks xmlns:a="http://schemas.openxmlformats.org/drawingml/2006/main" noChangeAspect="1"/>
+            </wp:cNvGraphicFramePr>
+            <a:graphic xmlns:a="http://schemas.openxmlformats.org/drawingml/2006/main">
+              <a:graphicData uri="http://schemas.openxmlformats.org/drawingml/2006/picture">
+                <pic:pic xmlns:pic="http://schemas.openxmlformats.org/drawingml/2006/picture">
+                  <pic:nvPicPr>
+                    <pic:cNvPr id="1" name=""/>
+                    <pic:cNvPicPr/>
+                  </pic:nvPicPr>
+                  <pic:blipFill>
+                    <a:blip r:embed="rId37"/>
+                    <a:stretch>
+                      <a:fillRect/>
+                    </a:stretch>
+                  </pic:blipFill>
+                  <pic:spPr>
+                    <a:xfrm>
+                      <a:off x="0" y="0"/>
+                      <a:ext cx="5731510" cy="849630"/>
+                    </a:xfrm>
+                    <a:prstGeom prst="rect">
+                      <a:avLst/>
+                    </a:prstGeom>
+                  </pic:spPr>
+                </pic:pic>
+              </a:graphicData>
+            </a:graphic>
+          </wp:inline>
+        </w:drawing>
+      </w:r>
+    </w:p>
+    <w:p>
+      <w:pPr>
+        <w:rPr>
+          <w:rFonts w:ascii="Montserrat" w:hAnsi="Montserrat"/>
+          <w:lang w:val="en-MY"/>
+        </w:rPr>
+      </w:pPr>
     </w:p>
     <w:p>
       <w:pPr>
@@ -9502,6 +9630,7 @@
           <w:color w:val="1A3E6B"/>
           <w:lang w:val="en-MY"/>
         </w:rPr>
+        <w:lastRenderedPageBreak/>
         <w:t xml:space="preserve">Task 5 - </w:t>
       </w:r>
       <w:r>
@@ -10279,7 +10408,7 @@
   <w:abstractNum w:abstractNumId="6" w15:restartNumberingAfterBreak="0">
     <w:nsid w:val="2E69379B"/>
     <w:multiLevelType w:val="hybridMultilevel"/>
-    <w:tmpl w:val="E30A956E"/>
+    <w:tmpl w:val="B4E40B62"/>
     <w:lvl w:ilvl="0" w:tplc="04090001">
       <w:start w:val="1"/>
       <w:numFmt w:val="bullet"/>

</xml_diff>